<commit_message>
Bring the Word download up to the issued look too
The same stacked logo in the page header, Century Gothic for the body and
Arial Bold for the headings, labels and column headers, the cover's grey
details and grey italic small print, and the dark teal rule under each
heading. Word substitutes when a machine lacks the faces; the PDF is the
document that goes out, this is the one for editing.

Co-Authored-By: Claude Opus 5 <noreply@anthropic.com>
</commit_message>
<xml_diff>
--- a/src/lib/cv-export/tipp-focus-template.docx
+++ b/src/lib/cv-export/tipp-focus-template.docx
@@ -7,6 +7,7 @@
         <w:spacing w:before="1600" w:after="900" w:line="240" w:lineRule="auto"/>
         <w:jc w:val="center"/>
         <w:rPr>
+          <w:rFonts w:ascii="Century Gothic" w:hAnsi="Century Gothic" w:cs="Century Gothic"/>
           <w:b/>
           <w:sz w:val="24"/>
           <w:szCs w:val="24"/>
@@ -14,6 +15,7 @@
       </w:pPr>
       <w:r>
         <w:rPr>
+          <w:rFonts w:ascii="Century Gothic" w:hAnsi="Century Gothic" w:cs="Century Gothic"/>
           <w:b/>
           <w:sz w:val="24"/>
           <w:szCs w:val="24"/>
@@ -26,6 +28,7 @@
         <w:spacing w:before="0" w:after="200" w:line="240" w:lineRule="auto"/>
         <w:jc w:val="center"/>
         <w:rPr>
+          <w:rFonts w:ascii="Century Gothic" w:hAnsi="Century Gothic" w:cs="Century Gothic"/>
           <w:b/>
           <w:sz w:val="32"/>
           <w:szCs w:val="32"/>
@@ -33,6 +36,7 @@
       </w:pPr>
       <w:r>
         <w:rPr>
+          <w:rFonts w:ascii="Century Gothic" w:hAnsi="Century Gothic" w:cs="Century Gothic"/>
           <w:b/>
           <w:sz w:val="32"/>
           <w:szCs w:val="32"/>
@@ -45,6 +49,7 @@
         <w:spacing w:before="0" w:after="800" w:line="240" w:lineRule="auto"/>
         <w:jc w:val="center"/>
         <w:rPr>
+          <w:rFonts w:ascii="Century Gothic" w:hAnsi="Century Gothic" w:cs="Century Gothic"/>
           <w:b/>
           <w:sz w:val="32"/>
           <w:szCs w:val="32"/>
@@ -52,6 +57,7 @@
       </w:pPr>
       <w:r>
         <w:rPr>
+          <w:rFonts w:ascii="Century Gothic" w:hAnsi="Century Gothic" w:cs="Century Gothic"/>
           <w:b/>
           <w:sz w:val="32"/>
           <w:szCs w:val="32"/>
@@ -67,12 +73,16 @@
         <w:spacing w:before="0" w:after="40" w:line="240" w:lineRule="auto"/>
         <w:jc w:val="left"/>
         <w:rPr>
+          <w:rFonts w:ascii="Century Gothic" w:hAnsi="Century Gothic" w:cs="Century Gothic"/>
+          <w:color w:val="808080"/>
           <w:sz w:val="18"/>
           <w:szCs w:val="18"/>
         </w:rPr>
       </w:pPr>
       <w:r>
         <w:rPr>
+          <w:rFonts w:ascii="Century Gothic" w:hAnsi="Century Gothic" w:cs="Century Gothic"/>
+          <w:color w:val="808080"/>
           <w:sz w:val="18"/>
           <w:szCs w:val="18"/>
         </w:rPr>
@@ -80,6 +90,8 @@
       </w:r>
       <w:r>
         <w:rPr>
+          <w:rFonts w:ascii="Century Gothic" w:hAnsi="Century Gothic" w:cs="Century Gothic"/>
+          <w:color w:val="808080"/>
           <w:sz w:val="18"/>
           <w:szCs w:val="18"/>
         </w:rPr>
@@ -87,6 +99,8 @@
       </w:r>
       <w:r>
         <w:rPr>
+          <w:rFonts w:ascii="Century Gothic" w:hAnsi="Century Gothic" w:cs="Century Gothic"/>
+          <w:color w:val="808080"/>
           <w:sz w:val="18"/>
           <w:szCs w:val="18"/>
         </w:rPr>
@@ -101,12 +115,16 @@
         <w:spacing w:before="0" w:after="40" w:line="240" w:lineRule="auto"/>
         <w:jc w:val="left"/>
         <w:rPr>
+          <w:rFonts w:ascii="Century Gothic" w:hAnsi="Century Gothic" w:cs="Century Gothic"/>
+          <w:color w:val="808080"/>
           <w:sz w:val="18"/>
           <w:szCs w:val="18"/>
         </w:rPr>
       </w:pPr>
       <w:r>
         <w:rPr>
+          <w:rFonts w:ascii="Century Gothic" w:hAnsi="Century Gothic" w:cs="Century Gothic"/>
+          <w:color w:val="808080"/>
           <w:sz w:val="18"/>
           <w:szCs w:val="18"/>
         </w:rPr>
@@ -114,6 +132,8 @@
       </w:r>
       <w:r>
         <w:rPr>
+          <w:rFonts w:ascii="Century Gothic" w:hAnsi="Century Gothic" w:cs="Century Gothic"/>
+          <w:color w:val="808080"/>
           <w:sz w:val="18"/>
           <w:szCs w:val="18"/>
         </w:rPr>
@@ -121,6 +141,8 @@
       </w:r>
       <w:r>
         <w:rPr>
+          <w:rFonts w:ascii="Century Gothic" w:hAnsi="Century Gothic" w:cs="Century Gothic"/>
+          <w:color w:val="808080"/>
           <w:sz w:val="18"/>
           <w:szCs w:val="18"/>
         </w:rPr>
@@ -135,12 +157,16 @@
         <w:spacing w:before="0" w:after="40" w:line="240" w:lineRule="auto"/>
         <w:jc w:val="left"/>
         <w:rPr>
+          <w:rFonts w:ascii="Century Gothic" w:hAnsi="Century Gothic" w:cs="Century Gothic"/>
+          <w:color w:val="808080"/>
           <w:sz w:val="18"/>
           <w:szCs w:val="18"/>
         </w:rPr>
       </w:pPr>
       <w:r>
         <w:rPr>
+          <w:rFonts w:ascii="Century Gothic" w:hAnsi="Century Gothic" w:cs="Century Gothic"/>
+          <w:color w:val="808080"/>
           <w:sz w:val="18"/>
           <w:szCs w:val="18"/>
         </w:rPr>
@@ -148,6 +174,8 @@
       </w:r>
       <w:r>
         <w:rPr>
+          <w:rFonts w:ascii="Century Gothic" w:hAnsi="Century Gothic" w:cs="Century Gothic"/>
+          <w:color w:val="808080"/>
           <w:sz w:val="18"/>
           <w:szCs w:val="18"/>
         </w:rPr>
@@ -155,6 +183,8 @@
       </w:r>
       <w:r>
         <w:rPr>
+          <w:rFonts w:ascii="Century Gothic" w:hAnsi="Century Gothic" w:cs="Century Gothic"/>
+          <w:color w:val="808080"/>
           <w:sz w:val="18"/>
           <w:szCs w:val="18"/>
         </w:rPr>
@@ -169,12 +199,16 @@
         <w:spacing w:before="0" w:after="400" w:line="240" w:lineRule="auto"/>
         <w:jc w:val="left"/>
         <w:rPr>
+          <w:rFonts w:ascii="Century Gothic" w:hAnsi="Century Gothic" w:cs="Century Gothic"/>
+          <w:color w:val="808080"/>
           <w:sz w:val="18"/>
           <w:szCs w:val="18"/>
         </w:rPr>
       </w:pPr>
       <w:r>
         <w:rPr>
+          <w:rFonts w:ascii="Century Gothic" w:hAnsi="Century Gothic" w:cs="Century Gothic"/>
+          <w:color w:val="808080"/>
           <w:sz w:val="18"/>
           <w:szCs w:val="18"/>
         </w:rPr>
@@ -182,6 +216,8 @@
       </w:r>
       <w:r>
         <w:rPr>
+          <w:rFonts w:ascii="Century Gothic" w:hAnsi="Century Gothic" w:cs="Century Gothic"/>
+          <w:color w:val="808080"/>
           <w:sz w:val="18"/>
           <w:szCs w:val="18"/>
         </w:rPr>
@@ -189,6 +225,8 @@
       </w:r>
       <w:r>
         <w:rPr>
+          <w:rFonts w:ascii="Century Gothic" w:hAnsi="Century Gothic" w:cs="Century Gothic"/>
+          <w:color w:val="808080"/>
           <w:sz w:val="18"/>
           <w:szCs w:val="18"/>
         </w:rPr>
@@ -200,12 +238,18 @@
         <w:spacing w:before="0" w:after="120" w:line="240" w:lineRule="auto"/>
         <w:jc w:val="left"/>
         <w:rPr>
+          <w:rFonts w:ascii="Century Gothic" w:hAnsi="Century Gothic" w:cs="Century Gothic"/>
+          <w:i/>
+          <w:color w:val="808080"/>
           <w:sz w:val="16"/>
           <w:szCs w:val="16"/>
         </w:rPr>
       </w:pPr>
       <w:r>
         <w:rPr>
+          <w:rFonts w:ascii="Century Gothic" w:hAnsi="Century Gothic" w:cs="Century Gothic"/>
+          <w:i/>
+          <w:color w:val="808080"/>
           <w:sz w:val="16"/>
           <w:szCs w:val="16"/>
         </w:rPr>
@@ -218,12 +262,18 @@
         <w:ind w:left="360" w:hanging="360"/>
         <w:jc w:val="left"/>
         <w:rPr>
+          <w:rFonts w:ascii="Century Gothic" w:hAnsi="Century Gothic" w:cs="Century Gothic"/>
+          <w:i/>
+          <w:color w:val="808080"/>
           <w:sz w:val="16"/>
           <w:szCs w:val="16"/>
         </w:rPr>
       </w:pPr>
       <w:r>
         <w:rPr>
+          <w:rFonts w:ascii="Century Gothic" w:hAnsi="Century Gothic" w:cs="Century Gothic"/>
+          <w:i/>
+          <w:color w:val="808080"/>
           <w:sz w:val="16"/>
           <w:szCs w:val="16"/>
         </w:rPr>
@@ -231,6 +281,9 @@
       </w:r>
       <w:r>
         <w:rPr>
+          <w:rFonts w:ascii="Century Gothic" w:hAnsi="Century Gothic" w:cs="Century Gothic"/>
+          <w:i/>
+          <w:color w:val="808080"/>
           <w:sz w:val="16"/>
           <w:szCs w:val="16"/>
         </w:rPr>
@@ -238,6 +291,9 @@
       </w:r>
       <w:r>
         <w:rPr>
+          <w:rFonts w:ascii="Century Gothic" w:hAnsi="Century Gothic" w:cs="Century Gothic"/>
+          <w:i/>
+          <w:color w:val="808080"/>
           <w:sz w:val="16"/>
           <w:szCs w:val="16"/>
         </w:rPr>
@@ -250,12 +306,18 @@
         <w:ind w:left="360" w:hanging="360"/>
         <w:jc w:val="left"/>
         <w:rPr>
+          <w:rFonts w:ascii="Century Gothic" w:hAnsi="Century Gothic" w:cs="Century Gothic"/>
+          <w:i/>
+          <w:color w:val="808080"/>
           <w:sz w:val="16"/>
           <w:szCs w:val="16"/>
         </w:rPr>
       </w:pPr>
       <w:r>
         <w:rPr>
+          <w:rFonts w:ascii="Century Gothic" w:hAnsi="Century Gothic" w:cs="Century Gothic"/>
+          <w:i/>
+          <w:color w:val="808080"/>
           <w:sz w:val="16"/>
           <w:szCs w:val="16"/>
         </w:rPr>
@@ -263,6 +325,9 @@
       </w:r>
       <w:r>
         <w:rPr>
+          <w:rFonts w:ascii="Century Gothic" w:hAnsi="Century Gothic" w:cs="Century Gothic"/>
+          <w:i/>
+          <w:color w:val="808080"/>
           <w:sz w:val="16"/>
           <w:szCs w:val="16"/>
         </w:rPr>
@@ -270,6 +335,9 @@
       </w:r>
       <w:r>
         <w:rPr>
+          <w:rFonts w:ascii="Century Gothic" w:hAnsi="Century Gothic" w:cs="Century Gothic"/>
+          <w:i/>
+          <w:color w:val="808080"/>
           <w:sz w:val="16"/>
           <w:szCs w:val="16"/>
         </w:rPr>
@@ -282,12 +350,18 @@
         <w:ind w:left="360" w:hanging="360"/>
         <w:jc w:val="left"/>
         <w:rPr>
+          <w:rFonts w:ascii="Century Gothic" w:hAnsi="Century Gothic" w:cs="Century Gothic"/>
+          <w:i/>
+          <w:color w:val="808080"/>
           <w:sz w:val="16"/>
           <w:szCs w:val="16"/>
         </w:rPr>
       </w:pPr>
       <w:r>
         <w:rPr>
+          <w:rFonts w:ascii="Century Gothic" w:hAnsi="Century Gothic" w:cs="Century Gothic"/>
+          <w:i/>
+          <w:color w:val="808080"/>
           <w:sz w:val="16"/>
           <w:szCs w:val="16"/>
         </w:rPr>
@@ -295,6 +369,9 @@
       </w:r>
       <w:r>
         <w:rPr>
+          <w:rFonts w:ascii="Century Gothic" w:hAnsi="Century Gothic" w:cs="Century Gothic"/>
+          <w:i/>
+          <w:color w:val="808080"/>
           <w:sz w:val="16"/>
           <w:szCs w:val="16"/>
         </w:rPr>
@@ -302,6 +379,9 @@
       </w:r>
       <w:r>
         <w:rPr>
+          <w:rFonts w:ascii="Century Gothic" w:hAnsi="Century Gothic" w:cs="Century Gothic"/>
+          <w:i/>
+          <w:color w:val="808080"/>
           <w:sz w:val="16"/>
           <w:szCs w:val="16"/>
         </w:rPr>
@@ -314,12 +394,18 @@
         <w:ind w:left="360" w:hanging="360"/>
         <w:jc w:val="left"/>
         <w:rPr>
+          <w:rFonts w:ascii="Century Gothic" w:hAnsi="Century Gothic" w:cs="Century Gothic"/>
+          <w:i/>
+          <w:color w:val="808080"/>
           <w:sz w:val="16"/>
           <w:szCs w:val="16"/>
         </w:rPr>
       </w:pPr>
       <w:r>
         <w:rPr>
+          <w:rFonts w:ascii="Century Gothic" w:hAnsi="Century Gothic" w:cs="Century Gothic"/>
+          <w:i/>
+          <w:color w:val="808080"/>
           <w:sz w:val="16"/>
           <w:szCs w:val="16"/>
         </w:rPr>
@@ -327,6 +413,9 @@
       </w:r>
       <w:r>
         <w:rPr>
+          <w:rFonts w:ascii="Century Gothic" w:hAnsi="Century Gothic" w:cs="Century Gothic"/>
+          <w:i/>
+          <w:color w:val="808080"/>
           <w:sz w:val="16"/>
           <w:szCs w:val="16"/>
         </w:rPr>
@@ -334,6 +423,9 @@
       </w:r>
       <w:r>
         <w:rPr>
+          <w:rFonts w:ascii="Century Gothic" w:hAnsi="Century Gothic" w:cs="Century Gothic"/>
+          <w:i/>
+          <w:color w:val="808080"/>
           <w:sz w:val="16"/>
           <w:szCs w:val="16"/>
         </w:rPr>
@@ -346,12 +438,18 @@
         <w:ind w:left="360" w:hanging="360"/>
         <w:jc w:val="left"/>
         <w:rPr>
+          <w:rFonts w:ascii="Century Gothic" w:hAnsi="Century Gothic" w:cs="Century Gothic"/>
+          <w:i/>
+          <w:color w:val="808080"/>
           <w:sz w:val="16"/>
           <w:szCs w:val="16"/>
         </w:rPr>
       </w:pPr>
       <w:r>
         <w:rPr>
+          <w:rFonts w:ascii="Century Gothic" w:hAnsi="Century Gothic" w:cs="Century Gothic"/>
+          <w:i/>
+          <w:color w:val="808080"/>
           <w:sz w:val="16"/>
           <w:szCs w:val="16"/>
         </w:rPr>
@@ -359,6 +457,9 @@
       </w:r>
       <w:r>
         <w:rPr>
+          <w:rFonts w:ascii="Century Gothic" w:hAnsi="Century Gothic" w:cs="Century Gothic"/>
+          <w:i/>
+          <w:color w:val="808080"/>
           <w:sz w:val="16"/>
           <w:szCs w:val="16"/>
         </w:rPr>
@@ -366,6 +467,9 @@
       </w:r>
       <w:r>
         <w:rPr>
+          <w:rFonts w:ascii="Century Gothic" w:hAnsi="Century Gothic" w:cs="Century Gothic"/>
+          <w:i/>
+          <w:color w:val="808080"/>
           <w:sz w:val="16"/>
           <w:szCs w:val="16"/>
         </w:rPr>
@@ -377,14 +481,20 @@
         <w:spacing w:before="0" w:after="120" w:line="240" w:lineRule="auto"/>
         <w:jc w:val="left"/>
         <w:rPr>
+          <w:rFonts w:ascii="Century Gothic" w:hAnsi="Century Gothic" w:cs="Century Gothic"/>
           <w:b/>
+          <w:i/>
+          <w:color w:val="808080"/>
           <w:sz w:val="16"/>
           <w:szCs w:val="16"/>
         </w:rPr>
       </w:pPr>
       <w:r>
         <w:rPr>
+          <w:rFonts w:ascii="Century Gothic" w:hAnsi="Century Gothic" w:cs="Century Gothic"/>
           <w:b/>
+          <w:i/>
+          <w:color w:val="808080"/>
           <w:sz w:val="16"/>
           <w:szCs w:val="16"/>
         </w:rPr>
@@ -396,12 +506,18 @@
         <w:spacing w:before="0" w:after="120" w:line="240" w:lineRule="auto"/>
         <w:jc w:val="left"/>
         <w:rPr>
+          <w:rFonts w:ascii="Century Gothic" w:hAnsi="Century Gothic" w:cs="Century Gothic"/>
+          <w:i/>
+          <w:color w:val="808080"/>
           <w:sz w:val="16"/>
           <w:szCs w:val="16"/>
         </w:rPr>
       </w:pPr>
       <w:r>
         <w:rPr>
+          <w:rFonts w:ascii="Century Gothic" w:hAnsi="Century Gothic" w:cs="Century Gothic"/>
+          <w:i/>
+          <w:color w:val="808080"/>
           <w:sz w:val="16"/>
           <w:szCs w:val="16"/>
         </w:rPr>
@@ -413,12 +529,18 @@
         <w:spacing w:before="0" w:after="60" w:line="240" w:lineRule="auto"/>
         <w:jc w:val="left"/>
         <w:rPr>
+          <w:rFonts w:ascii="Century Gothic" w:hAnsi="Century Gothic" w:cs="Century Gothic"/>
+          <w:i/>
+          <w:color w:val="808080"/>
           <w:sz w:val="16"/>
           <w:szCs w:val="16"/>
         </w:rPr>
       </w:pPr>
       <w:r>
         <w:rPr>
+          <w:rFonts w:ascii="Century Gothic" w:hAnsi="Century Gothic" w:cs="Century Gothic"/>
+          <w:i/>
+          <w:color w:val="808080"/>
           <w:sz w:val="16"/>
           <w:szCs w:val="16"/>
         </w:rPr>
@@ -470,8 +592,8 @@
             </w:pPr>
             <w:r>
               <w:rPr>
+                <w:rFonts w:ascii="Arial" w:hAnsi="Arial" w:cs="Arial"/>
                 <w:b/>
-                <w:rFonts w:asciiTheme="minorHAnsi" w:hAnsiTheme="minorHAnsi" w:cstheme="minorHAnsi"/>
                 <w:lang w:val="en-ZA"/>
                 <w:sz w:val="24"/>
                 <w:szCs w:val="24"/>
@@ -498,6 +620,7 @@
             </w:pPr>
             <w:r>
               <w:rPr>
+                <w:rFonts w:ascii="Century Gothic" w:hAnsi="Century Gothic" w:cs="Century Gothic"/>
                 <w:sz w:val="18"/>
                 <w:szCs w:val="18"/>
               </w:rPr>
@@ -529,8 +652,8 @@
             </w:pPr>
             <w:r>
               <w:rPr>
+                <w:rFonts w:ascii="Arial" w:hAnsi="Arial" w:cs="Arial"/>
                 <w:b/>
-                <w:rFonts w:asciiTheme="minorHAnsi" w:hAnsiTheme="minorHAnsi" w:cstheme="minorHAnsi"/>
                 <w:lang w:val="en-ZA"/>
                 <w:sz w:val="24"/>
                 <w:szCs w:val="24"/>
@@ -557,6 +680,7 @@
             </w:pPr>
             <w:r>
               <w:rPr>
+                <w:rFonts w:ascii="Century Gothic" w:hAnsi="Century Gothic" w:cs="Century Gothic"/>
                 <w:sz w:val="18"/>
                 <w:szCs w:val="18"/>
               </w:rPr>
@@ -588,8 +712,8 @@
             </w:pPr>
             <w:r>
               <w:rPr>
+                <w:rFonts w:ascii="Arial" w:hAnsi="Arial" w:cs="Arial"/>
                 <w:b/>
-                <w:rFonts w:asciiTheme="minorHAnsi" w:hAnsiTheme="minorHAnsi" w:cstheme="minorHAnsi"/>
                 <w:lang w:val="en-ZA"/>
                 <w:sz w:val="24"/>
                 <w:szCs w:val="24"/>
@@ -616,6 +740,7 @@
             </w:pPr>
             <w:r>
               <w:rPr>
+                <w:rFonts w:ascii="Century Gothic" w:hAnsi="Century Gothic" w:cs="Century Gothic"/>
                 <w:sz w:val="18"/>
                 <w:szCs w:val="18"/>
               </w:rPr>
@@ -647,8 +772,8 @@
             </w:pPr>
             <w:r>
               <w:rPr>
+                <w:rFonts w:ascii="Arial" w:hAnsi="Arial" w:cs="Arial"/>
                 <w:b/>
-                <w:rFonts w:asciiTheme="minorHAnsi" w:hAnsiTheme="minorHAnsi" w:cstheme="minorHAnsi"/>
                 <w:lang w:val="en-ZA"/>
                 <w:sz w:val="24"/>
                 <w:szCs w:val="24"/>
@@ -675,6 +800,7 @@
             </w:pPr>
             <w:r>
               <w:rPr>
+                <w:rFonts w:ascii="Century Gothic" w:hAnsi="Century Gothic" w:cs="Century Gothic"/>
                 <w:sz w:val="18"/>
                 <w:szCs w:val="18"/>
               </w:rPr>
@@ -706,8 +832,8 @@
             </w:pPr>
             <w:r>
               <w:rPr>
+                <w:rFonts w:ascii="Arial" w:hAnsi="Arial" w:cs="Arial"/>
                 <w:b/>
-                <w:rFonts w:asciiTheme="minorHAnsi" w:hAnsiTheme="minorHAnsi" w:cstheme="minorHAnsi"/>
                 <w:lang w:val="en-ZA"/>
                 <w:sz w:val="24"/>
                 <w:szCs w:val="24"/>
@@ -734,6 +860,7 @@
             </w:pPr>
             <w:r>
               <w:rPr>
+                <w:rFonts w:ascii="Century Gothic" w:hAnsi="Century Gothic" w:cs="Century Gothic"/>
                 <w:sz w:val="18"/>
                 <w:szCs w:val="18"/>
               </w:rPr>
@@ -765,8 +892,8 @@
             </w:pPr>
             <w:r>
               <w:rPr>
+                <w:rFonts w:ascii="Arial" w:hAnsi="Arial" w:cs="Arial"/>
                 <w:b/>
-                <w:rFonts w:asciiTheme="minorHAnsi" w:hAnsiTheme="minorHAnsi" w:cstheme="minorHAnsi"/>
                 <w:lang w:val="en-ZA"/>
                 <w:sz w:val="24"/>
                 <w:szCs w:val="24"/>
@@ -793,6 +920,7 @@
             </w:pPr>
             <w:r>
               <w:rPr>
+                <w:rFonts w:ascii="Century Gothic" w:hAnsi="Century Gothic" w:cs="Century Gothic"/>
                 <w:sz w:val="18"/>
                 <w:szCs w:val="18"/>
               </w:rPr>
@@ -836,7 +964,7 @@
           <w:tcPr>
             <w:tcW w:w="9782" w:type="dxa"/>
             <w:tcBorders>
-              <w:bottom w:val="single" w:sz="18" w:space="0" w:color="2E74B5" w:themeColor="accent1" w:themeShade="BF"/>
+              <w:bottom w:val="single" w:sz="18" w:space="0" w:color="0F4761"/>
             </w:tcBorders>
             <w:shd w:val="clear" w:color="auto" w:fill="auto"/>
             <w:tcMar>
@@ -856,7 +984,8 @@
             </w:pPr>
             <w:r>
               <w:rPr>
-                <w:rFonts w:asciiTheme="minorHAnsi" w:hAnsiTheme="minorHAnsi" w:cstheme="minorHAnsi"/>
+                <w:rFonts w:ascii="Arial" w:hAnsi="Arial" w:cs="Arial"/>
+                <w:b/>
                 <w:sz w:val="24"/>
                 <w:szCs w:val="24"/>
               </w:rPr>
@@ -908,6 +1037,7 @@
             </w:pPr>
             <w:r>
               <w:rPr>
+                <w:rFonts w:ascii="Century Gothic" w:hAnsi="Century Gothic" w:cs="Century Gothic"/>
                 <w:sz w:val="18"/>
                 <w:szCs w:val="18"/>
               </w:rPr>
@@ -1028,7 +1158,7 @@
           <w:tcPr>
             <w:tcW w:w="9782" w:type="dxa"/>
             <w:tcBorders>
-              <w:bottom w:val="single" w:sz="18" w:space="0" w:color="2E74B5" w:themeColor="accent1" w:themeShade="BF"/>
+              <w:bottom w:val="single" w:sz="18" w:space="0" w:color="0F4761"/>
             </w:tcBorders>
             <w:shd w:val="clear" w:color="auto" w:fill="auto"/>
             <w:vAlign w:val="center"/>
@@ -1048,9 +1178,8 @@
             </w:pPr>
             <w:r>
               <w:rPr>
-                <w:rFonts w:asciiTheme="minorHAnsi" w:hAnsiTheme="minorHAnsi" w:cstheme="minorHAnsi"/>
+                <w:rFonts w:ascii="Arial" w:hAnsi="Arial" w:cs="Arial"/>
                 <w:b/>
-                <w:bCs/>
                 <w:sz w:val="24"/>
                 <w:szCs w:val="24"/>
               </w:rPr>
@@ -1106,8 +1235,8 @@
             </w:pPr>
             <w:r>
               <w:rPr>
+                <w:rFonts w:ascii="Arial" w:hAnsi="Arial" w:cs="Arial"/>
                 <w:b/>
-                <w:rFonts w:asciiTheme="minorHAnsi" w:hAnsiTheme="minorHAnsi" w:cstheme="minorHAnsi"/>
                 <w:sz w:val="22"/>
                 <w:szCs w:val="22"/>
               </w:rPr>
@@ -1133,8 +1262,8 @@
             </w:pPr>
             <w:r>
               <w:rPr>
+                <w:rFonts w:ascii="Arial" w:hAnsi="Arial" w:cs="Arial"/>
                 <w:b/>
-                <w:rFonts w:asciiTheme="minorHAnsi" w:hAnsiTheme="minorHAnsi" w:cstheme="minorHAnsi"/>
                 <w:sz w:val="22"/>
                 <w:szCs w:val="22"/>
               </w:rPr>
@@ -1160,8 +1289,8 @@
             </w:pPr>
             <w:r>
               <w:rPr>
+                <w:rFonts w:ascii="Arial" w:hAnsi="Arial" w:cs="Arial"/>
                 <w:b/>
-                <w:rFonts w:asciiTheme="minorHAnsi" w:hAnsiTheme="minorHAnsi" w:cstheme="minorHAnsi"/>
                 <w:sz w:val="22"/>
                 <w:szCs w:val="22"/>
               </w:rPr>
@@ -1190,6 +1319,7 @@
             </w:pPr>
             <w:r>
               <w:rPr>
+                <w:rFonts w:ascii="Century Gothic" w:hAnsi="Century Gothic" w:cs="Century Gothic"/>
                 <w:sz w:val="18"/>
                 <w:szCs w:val="18"/>
               </w:rPr>
@@ -1213,6 +1343,7 @@
             </w:pPr>
             <w:r>
               <w:rPr>
+                <w:rFonts w:ascii="Century Gothic" w:hAnsi="Century Gothic" w:cs="Century Gothic"/>
                 <w:sz w:val="18"/>
                 <w:szCs w:val="18"/>
               </w:rPr>
@@ -1236,6 +1367,7 @@
             </w:pPr>
             <w:r>
               <w:rPr>
+                <w:rFonts w:ascii="Century Gothic" w:hAnsi="Century Gothic" w:cs="Century Gothic"/>
                 <w:sz w:val="18"/>
                 <w:szCs w:val="18"/>
               </w:rPr>
@@ -1274,7 +1406,7 @@
           <w:tcPr>
             <w:tcW w:w="9782" w:type="dxa"/>
             <w:tcBorders>
-              <w:bottom w:val="single" w:sz="18" w:space="0" w:color="2E74B5" w:themeColor="accent1" w:themeShade="BF"/>
+              <w:bottom w:val="single" w:sz="18" w:space="0" w:color="0F4761"/>
             </w:tcBorders>
             <w:shd w:val="clear" w:color="auto" w:fill="auto"/>
             <w:vAlign w:val="center"/>
@@ -1294,9 +1426,8 @@
             </w:pPr>
             <w:r>
               <w:rPr>
-                <w:rFonts w:asciiTheme="minorHAnsi" w:hAnsiTheme="minorHAnsi" w:cstheme="minorHAnsi"/>
+                <w:rFonts w:ascii="Arial" w:hAnsi="Arial" w:cs="Arial"/>
                 <w:b/>
-                <w:bCs/>
                 <w:sz w:val="24"/>
                 <w:szCs w:val="24"/>
               </w:rPr>
@@ -1352,8 +1483,8 @@
             </w:pPr>
             <w:r>
               <w:rPr>
+                <w:rFonts w:ascii="Arial" w:hAnsi="Arial" w:cs="Arial"/>
                 <w:b/>
-                <w:rFonts w:asciiTheme="minorHAnsi" w:hAnsiTheme="minorHAnsi" w:cstheme="minorHAnsi"/>
                 <w:sz w:val="22"/>
                 <w:szCs w:val="22"/>
               </w:rPr>
@@ -1379,8 +1510,8 @@
             </w:pPr>
             <w:r>
               <w:rPr>
+                <w:rFonts w:ascii="Arial" w:hAnsi="Arial" w:cs="Arial"/>
                 <w:b/>
-                <w:rFonts w:asciiTheme="minorHAnsi" w:hAnsiTheme="minorHAnsi" w:cstheme="minorHAnsi"/>
                 <w:sz w:val="22"/>
                 <w:szCs w:val="22"/>
               </w:rPr>
@@ -1406,8 +1537,8 @@
             </w:pPr>
             <w:r>
               <w:rPr>
+                <w:rFonts w:ascii="Arial" w:hAnsi="Arial" w:cs="Arial"/>
                 <w:b/>
-                <w:rFonts w:asciiTheme="minorHAnsi" w:hAnsiTheme="minorHAnsi" w:cstheme="minorHAnsi"/>
                 <w:sz w:val="22"/>
                 <w:szCs w:val="22"/>
               </w:rPr>
@@ -1435,6 +1566,7 @@
             </w:pPr>
             <w:r>
               <w:rPr>
+                <w:rFonts w:ascii="Century Gothic" w:hAnsi="Century Gothic" w:cs="Century Gothic"/>
                 <w:sz w:val="18"/>
                 <w:szCs w:val="18"/>
               </w:rPr>
@@ -1457,6 +1589,7 @@
             </w:pPr>
             <w:r>
               <w:rPr>
+                <w:rFonts w:ascii="Century Gothic" w:hAnsi="Century Gothic" w:cs="Century Gothic"/>
                 <w:sz w:val="18"/>
                 <w:szCs w:val="18"/>
               </w:rPr>
@@ -1479,6 +1612,7 @@
             </w:pPr>
             <w:r>
               <w:rPr>
+                <w:rFonts w:ascii="Century Gothic" w:hAnsi="Century Gothic" w:cs="Century Gothic"/>
                 <w:sz w:val="18"/>
                 <w:szCs w:val="18"/>
               </w:rPr>
@@ -1512,7 +1646,7 @@
           <w:tcPr>
             <w:tcW w:w="9782" w:type="dxa"/>
             <w:tcBorders>
-              <w:bottom w:val="single" w:sz="18" w:space="0" w:color="2E74B5" w:themeColor="accent1" w:themeShade="BF"/>
+              <w:bottom w:val="single" w:sz="18" w:space="0" w:color="0F4761"/>
             </w:tcBorders>
             <w:shd w:val="clear" w:color="auto" w:fill="auto"/>
             <w:vAlign w:val="center"/>
@@ -1529,7 +1663,7 @@
             </w:pPr>
             <w:r>
               <w:rPr>
-                <w:rFonts w:asciiTheme="minorHAnsi" w:hAnsiTheme="minorHAnsi" w:cstheme="minorHAnsi"/>
+                <w:rFonts w:ascii="Arial" w:hAnsi="Arial" w:cs="Arial"/>
                 <w:b/>
                 <w:sz w:val="24"/>
                 <w:szCs w:val="24"/>
@@ -1585,8 +1719,8 @@
             </w:pPr>
             <w:r>
               <w:rPr>
+                <w:rFonts w:ascii="Arial" w:hAnsi="Arial" w:cs="Arial"/>
                 <w:b/>
-                <w:rFonts w:asciiTheme="minorHAnsi" w:hAnsiTheme="minorHAnsi" w:cstheme="minorHAnsi"/>
                 <w:sz w:val="22"/>
                 <w:szCs w:val="22"/>
               </w:rPr>
@@ -1611,8 +1745,8 @@
             </w:pPr>
             <w:r>
               <w:rPr>
+                <w:rFonts w:ascii="Arial" w:hAnsi="Arial" w:cs="Arial"/>
                 <w:b/>
-                <w:rFonts w:asciiTheme="minorHAnsi" w:hAnsiTheme="minorHAnsi" w:cstheme="minorHAnsi"/>
                 <w:sz w:val="22"/>
                 <w:szCs w:val="22"/>
               </w:rPr>
@@ -1637,8 +1771,8 @@
             </w:pPr>
             <w:r>
               <w:rPr>
+                <w:rFonts w:ascii="Arial" w:hAnsi="Arial" w:cs="Arial"/>
                 <w:b/>
-                <w:rFonts w:asciiTheme="minorHAnsi" w:hAnsiTheme="minorHAnsi" w:cstheme="minorHAnsi"/>
                 <w:sz w:val="22"/>
                 <w:szCs w:val="22"/>
               </w:rPr>
@@ -1666,6 +1800,7 @@
             </w:pPr>
             <w:r>
               <w:rPr>
+                <w:rFonts w:ascii="Century Gothic" w:hAnsi="Century Gothic" w:cs="Century Gothic"/>
                 <w:sz w:val="18"/>
                 <w:szCs w:val="18"/>
               </w:rPr>
@@ -1688,6 +1823,7 @@
             </w:pPr>
             <w:r>
               <w:rPr>
+                <w:rFonts w:ascii="Century Gothic" w:hAnsi="Century Gothic" w:cs="Century Gothic"/>
                 <w:sz w:val="18"/>
                 <w:szCs w:val="18"/>
               </w:rPr>
@@ -1710,6 +1846,7 @@
             </w:pPr>
             <w:r>
               <w:rPr>
+                <w:rFonts w:ascii="Century Gothic" w:hAnsi="Century Gothic" w:cs="Century Gothic"/>
                 <w:sz w:val="18"/>
                 <w:szCs w:val="18"/>
               </w:rPr>
@@ -1742,7 +1879,7 @@
           <w:tcPr>
             <w:tcW w:w="9782" w:type="dxa"/>
             <w:tcBorders>
-              <w:bottom w:val="single" w:sz="18" w:space="0" w:color="2E74B5" w:themeColor="accent1" w:themeShade="BF"/>
+              <w:bottom w:val="single" w:sz="18" w:space="0" w:color="0F4761"/>
             </w:tcBorders>
             <w:shd w:val="clear" w:color="auto" w:fill="auto"/>
             <w:vAlign w:val="center"/>
@@ -1759,7 +1896,7 @@
             </w:pPr>
             <w:r>
               <w:rPr>
-                <w:rFonts w:asciiTheme="minorHAnsi" w:hAnsiTheme="minorHAnsi" w:cstheme="minorHAnsi"/>
+                <w:rFonts w:ascii="Arial" w:hAnsi="Arial" w:cs="Arial"/>
                 <w:b/>
                 <w:sz w:val="24"/>
                 <w:szCs w:val="24"/>
@@ -1816,8 +1953,8 @@
             </w:pPr>
             <w:r>
               <w:rPr>
+                <w:rFonts w:ascii="Arial" w:hAnsi="Arial" w:cs="Arial"/>
                 <w:b/>
-                <w:rFonts w:asciiTheme="minorHAnsi" w:hAnsiTheme="minorHAnsi" w:cstheme="minorHAnsi"/>
                 <w:sz w:val="22"/>
                 <w:szCs w:val="22"/>
               </w:rPr>
@@ -1843,8 +1980,8 @@
             </w:pPr>
             <w:r>
               <w:rPr>
+                <w:rFonts w:ascii="Arial" w:hAnsi="Arial" w:cs="Arial"/>
                 <w:b/>
-                <w:rFonts w:asciiTheme="minorHAnsi" w:hAnsiTheme="minorHAnsi" w:cstheme="minorHAnsi"/>
                 <w:sz w:val="22"/>
                 <w:szCs w:val="22"/>
               </w:rPr>
@@ -1870,8 +2007,8 @@
             </w:pPr>
             <w:r>
               <w:rPr>
+                <w:rFonts w:ascii="Arial" w:hAnsi="Arial" w:cs="Arial"/>
                 <w:b/>
-                <w:rFonts w:asciiTheme="minorHAnsi" w:hAnsiTheme="minorHAnsi" w:cstheme="minorHAnsi"/>
                 <w:sz w:val="22"/>
                 <w:szCs w:val="22"/>
               </w:rPr>
@@ -1899,6 +2036,7 @@
             </w:pPr>
             <w:r>
               <w:rPr>
+                <w:rFonts w:ascii="Century Gothic" w:hAnsi="Century Gothic" w:cs="Century Gothic"/>
                 <w:sz w:val="18"/>
                 <w:szCs w:val="18"/>
               </w:rPr>
@@ -1921,6 +2059,7 @@
             </w:pPr>
             <w:r>
               <w:rPr>
+                <w:rFonts w:ascii="Century Gothic" w:hAnsi="Century Gothic" w:cs="Century Gothic"/>
                 <w:sz w:val="18"/>
                 <w:szCs w:val="18"/>
               </w:rPr>
@@ -1943,6 +2082,7 @@
             </w:pPr>
             <w:r>
               <w:rPr>
+                <w:rFonts w:ascii="Century Gothic" w:hAnsi="Century Gothic" w:cs="Century Gothic"/>
                 <w:sz w:val="18"/>
                 <w:szCs w:val="18"/>
               </w:rPr>
@@ -1979,7 +2119,7 @@
           <w:tcPr>
             <w:tcW w:w="9782" w:type="dxa"/>
             <w:tcBorders>
-              <w:bottom w:val="single" w:sz="18" w:space="0" w:color="2E74B5" w:themeColor="accent1" w:themeShade="BF"/>
+              <w:bottom w:val="single" w:sz="18" w:space="0" w:color="0F4761"/>
             </w:tcBorders>
             <w:shd w:val="clear" w:color="auto" w:fill="auto"/>
             <w:vAlign w:val="center"/>
@@ -1996,7 +2136,7 @@
             </w:pPr>
             <w:r>
               <w:rPr>
-                <w:rFonts w:asciiTheme="minorHAnsi" w:hAnsiTheme="minorHAnsi" w:cstheme="minorHAnsi"/>
+                <w:rFonts w:ascii="Arial" w:hAnsi="Arial" w:cs="Arial"/>
                 <w:b/>
                 <w:sz w:val="24"/>
                 <w:szCs w:val="24"/>
@@ -2051,8 +2191,8 @@
             </w:pPr>
             <w:r>
               <w:rPr>
+                <w:rFonts w:ascii="Arial" w:hAnsi="Arial" w:cs="Arial"/>
                 <w:b/>
-                <w:rFonts w:asciiTheme="minorHAnsi" w:hAnsiTheme="minorHAnsi" w:cstheme="minorHAnsi"/>
                 <w:sz w:val="22"/>
                 <w:szCs w:val="22"/>
               </w:rPr>
@@ -2078,8 +2218,8 @@
             </w:pPr>
             <w:r>
               <w:rPr>
+                <w:rFonts w:ascii="Arial" w:hAnsi="Arial" w:cs="Arial"/>
                 <w:b/>
-                <w:rFonts w:asciiTheme="minorHAnsi" w:hAnsiTheme="minorHAnsi" w:cstheme="minorHAnsi"/>
                 <w:sz w:val="22"/>
                 <w:szCs w:val="22"/>
               </w:rPr>
@@ -2108,6 +2248,7 @@
             </w:pPr>
             <w:r>
               <w:rPr>
+                <w:rFonts w:ascii="Century Gothic" w:hAnsi="Century Gothic" w:cs="Century Gothic"/>
                 <w:sz w:val="18"/>
                 <w:szCs w:val="18"/>
               </w:rPr>
@@ -2131,6 +2272,7 @@
             </w:pPr>
             <w:r>
               <w:rPr>
+                <w:rFonts w:ascii="Century Gothic" w:hAnsi="Century Gothic" w:cs="Century Gothic"/>
                 <w:sz w:val="18"/>
                 <w:szCs w:val="18"/>
               </w:rPr>
@@ -2173,7 +2315,7 @@
           <w:tcPr>
             <w:tcW w:w="9782" w:type="dxa"/>
             <w:tcBorders>
-              <w:bottom w:val="single" w:sz="18" w:space="0" w:color="2E74B5" w:themeColor="accent1" w:themeShade="BF"/>
+              <w:bottom w:val="single" w:sz="18" w:space="0" w:color="0F4761"/>
             </w:tcBorders>
             <w:shd w:val="clear" w:color="auto" w:fill="auto"/>
             <w:vAlign w:val="center"/>
@@ -2190,7 +2332,7 @@
             </w:pPr>
             <w:r>
               <w:rPr>
-                <w:rFonts w:asciiTheme="minorHAnsi" w:hAnsiTheme="minorHAnsi" w:cstheme="minorHAnsi"/>
+                <w:rFonts w:ascii="Arial" w:hAnsi="Arial" w:cs="Arial"/>
                 <w:b/>
                 <w:sz w:val="24"/>
                 <w:szCs w:val="24"/>
@@ -2246,6 +2388,7 @@
             </w:pPr>
             <w:r>
               <w:rPr>
+                <w:rFonts w:ascii="Century Gothic" w:hAnsi="Century Gothic" w:cs="Century Gothic"/>
                 <w:sz w:val="18"/>
                 <w:szCs w:val="18"/>
               </w:rPr>
@@ -2283,7 +2426,7 @@
           <w:tcPr>
             <w:tcW w:w="9782" w:type="dxa"/>
             <w:tcBorders>
-              <w:bottom w:val="single" w:sz="18" w:space="0" w:color="2E74B5" w:themeColor="accent1" w:themeShade="BF"/>
+              <w:bottom w:val="single" w:sz="18" w:space="0" w:color="0F4761"/>
             </w:tcBorders>
             <w:shd w:val="clear" w:color="auto" w:fill="auto"/>
             <w:vAlign w:val="center"/>
@@ -2300,7 +2443,7 @@
             </w:pPr>
             <w:r>
               <w:rPr>
-                <w:rFonts w:asciiTheme="minorHAnsi" w:hAnsiTheme="minorHAnsi" w:cstheme="minorHAnsi"/>
+                <w:rFonts w:ascii="Arial" w:hAnsi="Arial" w:cs="Arial"/>
                 <w:b/>
                 <w:sz w:val="24"/>
                 <w:szCs w:val="24"/>
@@ -2360,8 +2503,8 @@
             </w:pPr>
             <w:r>
               <w:rPr>
+                <w:rFonts w:ascii="Arial" w:hAnsi="Arial" w:cs="Arial"/>
                 <w:b/>
-                <w:rFonts w:asciiTheme="minorHAnsi" w:hAnsiTheme="minorHAnsi" w:cstheme="minorHAnsi"/>
                 <w:sz w:val="22"/>
                 <w:szCs w:val="22"/>
               </w:rPr>
@@ -2391,7 +2534,7 @@
             </w:pPr>
             <w:r>
               <w:rPr>
-                <w:rFonts w:asciiTheme="minorHAnsi" w:hAnsiTheme="minorHAnsi" w:cstheme="minorHAnsi"/>
+                <w:rFonts w:ascii="Century Gothic" w:hAnsi="Century Gothic" w:cs="Century Gothic"/>
                 <w:sz w:val="18"/>
                 <w:szCs w:val="18"/>
               </w:rPr>
@@ -2428,8 +2571,8 @@
             </w:pPr>
             <w:r>
               <w:rPr>
+                <w:rFonts w:ascii="Arial" w:hAnsi="Arial" w:cs="Arial"/>
                 <w:b/>
-                <w:rFonts w:asciiTheme="minorHAnsi" w:hAnsiTheme="minorHAnsi" w:cstheme="minorHAnsi"/>
                 <w:sz w:val="22"/>
                 <w:szCs w:val="22"/>
               </w:rPr>
@@ -2459,7 +2602,7 @@
             </w:pPr>
             <w:r>
               <w:rPr>
-                <w:rFonts w:asciiTheme="minorHAnsi" w:hAnsiTheme="minorHAnsi" w:cstheme="minorHAnsi"/>
+                <w:rFonts w:ascii="Century Gothic" w:hAnsi="Century Gothic" w:cs="Century Gothic"/>
                 <w:sz w:val="18"/>
                 <w:szCs w:val="18"/>
               </w:rPr>
@@ -2496,8 +2639,8 @@
             </w:pPr>
             <w:r>
               <w:rPr>
+                <w:rFonts w:ascii="Arial" w:hAnsi="Arial" w:cs="Arial"/>
                 <w:b/>
-                <w:rFonts w:asciiTheme="minorHAnsi" w:hAnsiTheme="minorHAnsi" w:cstheme="minorHAnsi"/>
                 <w:sz w:val="22"/>
                 <w:szCs w:val="22"/>
               </w:rPr>
@@ -2527,7 +2670,7 @@
             </w:pPr>
             <w:r>
               <w:rPr>
-                <w:rFonts w:asciiTheme="minorHAnsi" w:hAnsiTheme="minorHAnsi" w:cstheme="minorHAnsi"/>
+                <w:rFonts w:ascii="Century Gothic" w:hAnsi="Century Gothic" w:cs="Century Gothic"/>
                 <w:sz w:val="18"/>
                 <w:szCs w:val="18"/>
               </w:rPr>
@@ -2564,8 +2707,8 @@
             </w:pPr>
             <w:r>
               <w:rPr>
+                <w:rFonts w:ascii="Arial" w:hAnsi="Arial" w:cs="Arial"/>
                 <w:b/>
-                <w:rFonts w:asciiTheme="minorHAnsi" w:hAnsiTheme="minorHAnsi" w:cstheme="minorHAnsi"/>
                 <w:sz w:val="22"/>
                 <w:szCs w:val="22"/>
               </w:rPr>
@@ -2595,7 +2738,7 @@
             </w:pPr>
             <w:r>
               <w:rPr>
-                <w:rFonts w:asciiTheme="minorHAnsi" w:hAnsiTheme="minorHAnsi" w:cstheme="minorHAnsi"/>
+                <w:rFonts w:ascii="Century Gothic" w:hAnsi="Century Gothic" w:cs="Century Gothic"/>
                 <w:sz w:val="18"/>
                 <w:szCs w:val="18"/>
               </w:rPr>
@@ -2635,8 +2778,8 @@
             </w:pPr>
             <w:r>
               <w:rPr>
+                <w:rFonts w:ascii="Century Gothic" w:hAnsi="Century Gothic" w:cs="Century Gothic"/>
                 <w:b/>
-                <w:rFonts w:asciiTheme="minorHAnsi" w:hAnsiTheme="minorHAnsi" w:cstheme="minorHAnsi"/>
                 <w:sz w:val="18"/>
                 <w:szCs w:val="18"/>
               </w:rPr>
@@ -2662,7 +2805,7 @@
             </w:pPr>
             <w:r>
               <w:rPr>
-                <w:rFonts w:cs="Arial"/>
+                <w:rFonts w:ascii="Century Gothic" w:hAnsi="Century Gothic" w:cs="Century Gothic"/>
                 <w:sz w:val="18"/>
                 <w:szCs w:val="18"/>
               </w:rPr>
@@ -2688,7 +2831,7 @@
             </w:pPr>
             <w:r>
               <w:rPr>
-                <w:rFonts w:cs="Arial"/>
+                <w:rFonts w:ascii="Century Gothic" w:hAnsi="Century Gothic" w:cs="Century Gothic"/>
                 <w:sz w:val="18"/>
                 <w:szCs w:val="18"/>
               </w:rPr>
@@ -2714,7 +2857,7 @@
             </w:pPr>
             <w:r>
               <w:rPr>
-                <w:rFonts w:cs="Arial"/>
+                <w:rFonts w:ascii="Century Gothic" w:hAnsi="Century Gothic" w:cs="Century Gothic"/>
                 <w:sz w:val="18"/>
                 <w:szCs w:val="18"/>
               </w:rPr>
@@ -2910,7 +3053,7 @@
           <wp:positionV relativeFrom="paragraph">
             <wp:posOffset>15875</wp:posOffset>
           </wp:positionV>
-          <wp:extent cx="1760855" cy="870585"/>
+          <wp:extent cx="1760855" cy="516400"/>
           <wp:effectExtent l="0" t="0" r="0" b="5715"/>
           <wp:wrapTight wrapText="bothSides">
             <wp:wrapPolygon edited="0">
@@ -2950,7 +3093,7 @@
                 <pic:spPr bwMode="auto">
                   <a:xfrm>
                     <a:off x="0" y="0"/>
-                    <a:ext cx="1760855" cy="870585"/>
+                    <a:ext cx="1760855" cy="516400"/>
                   </a:xfrm>
                   <a:prstGeom prst="rect">
                     <a:avLst/>
@@ -3082,7 +3225,7 @@
           <wp:positionV relativeFrom="paragraph">
             <wp:posOffset>6350</wp:posOffset>
           </wp:positionV>
-          <wp:extent cx="1760855" cy="870585"/>
+          <wp:extent cx="1760855" cy="516400"/>
           <wp:effectExtent l="0" t="0" r="0" b="5715"/>
           <wp:wrapTight wrapText="bothSides">
             <wp:wrapPolygon edited="0">
@@ -3122,7 +3265,7 @@
                 <pic:spPr bwMode="auto">
                   <a:xfrm>
                     <a:off x="0" y="0"/>
-                    <a:ext cx="1760855" cy="870585"/>
+                    <a:ext cx="1760855" cy="516400"/>
                   </a:xfrm>
                   <a:prstGeom prst="rect">
                     <a:avLst/>

</xml_diff>

<commit_message>
Put the issued CV's room between its tables
The Word download drew every employment block hard against the next, and
its section headings against their tables, because the older template has
nothing between them and Word shows two touching tables as one. Every
heading now has a line and a half of room before it and after its rule,
every employment block is followed by the same gap the issued CVs leave,
the sample block's fixed row height no longer leaves an empty box when a
duties list breaks across pages, the block's company, role and duration
are bold as the issued CVs set them, and the faint network graphic the
older template drew behind the career table is gone.

The PDF gets the issued gap between blocks too, and a heading now travels
with its column header and first row, so a page never ends on a heading
with nothing under it, nor on a column header with no row.

Co-Authored-By: Claude Opus 5 <noreply@anthropic.com>
</commit_message>
<xml_diff>
--- a/src/lib/cv-export/tipp-focus-template.docx
+++ b/src/lib/cv-export/tipp-focus-template.docx
@@ -932,11 +932,10 @@
     </w:tbl>
     <w:p>
       <w:pPr>
-        <w:spacing w:line="276" w:lineRule="auto"/>
+        <w:spacing w:before="0" w:after="360" w:line="240" w:lineRule="auto"/>
         <w:rPr>
-          <w:rFonts w:asciiTheme="minorHAnsi" w:hAnsiTheme="minorHAnsi" w:cstheme="minorHAnsi"/>
-          <w:szCs w:val="22"/>
-          <w:lang w:val="en-US"/>
+          <w:sz w:val="2"/>
+          <w:szCs w:val="2"/>
         </w:rPr>
       </w:pPr>
     </w:p>
@@ -995,6 +994,15 @@
         </w:tc>
       </w:tr>
     </w:tbl>
+    <w:p>
+      <w:pPr>
+        <w:spacing w:before="0" w:after="400" w:line="240" w:lineRule="auto"/>
+        <w:rPr>
+          <w:sz w:val="2"/>
+          <w:szCs w:val="2"/>
+        </w:rPr>
+      </w:pPr>
+    </w:p>
     <w:p/>
     <w:tbl>
       <w:tblPr>
@@ -1049,92 +1057,12 @@
     </w:tbl>
     <w:p>
       <w:pPr>
-        <w:tabs>
-          <w:tab w:val="left" w:pos="6292"/>
-        </w:tabs>
+        <w:spacing w:before="0" w:after="360" w:line="240" w:lineRule="auto"/>
         <w:rPr>
-          <w:rFonts w:asciiTheme="minorHAnsi" w:hAnsiTheme="minorHAnsi" w:cstheme="minorHAnsi"/>
+          <w:sz w:val="2"/>
+          <w:szCs w:val="2"/>
         </w:rPr>
       </w:pPr>
-      <w:r>
-        <w:rPr>
-          <w:rFonts w:asciiTheme="minorHAnsi" w:hAnsiTheme="minorHAnsi" w:cstheme="minorHAnsi"/>
-          <w:noProof/>
-          <w:lang w:val="en-ZA" w:eastAsia="en-ZA"/>
-        </w:rPr>
-        <w:drawing>
-          <wp:anchor distT="0" distB="0" distL="114300" distR="114300" simplePos="0" relativeHeight="251658240" behindDoc="1" locked="0" layoutInCell="1" allowOverlap="1" wp14:anchorId="03A1DE13" wp14:editId="211B26CC">
-            <wp:simplePos x="0" y="0"/>
-            <wp:positionH relativeFrom="column">
-              <wp:posOffset>2543810</wp:posOffset>
-            </wp:positionH>
-            <wp:positionV relativeFrom="paragraph">
-              <wp:posOffset>507365</wp:posOffset>
-            </wp:positionV>
-            <wp:extent cx="6321425" cy="4646930"/>
-            <wp:effectExtent l="0" t="0" r="3175" b="1270"/>
-            <wp:wrapNone/>
-            <wp:docPr id="8" name="Picture 8"/>
-            <wp:cNvGraphicFramePr>
-              <a:graphicFrameLocks xmlns:a="http://schemas.openxmlformats.org/drawingml/2006/main" noChangeAspect="1"/>
-            </wp:cNvGraphicFramePr>
-            <a:graphic xmlns:a="http://schemas.openxmlformats.org/drawingml/2006/main">
-              <a:graphicData uri="http://schemas.openxmlformats.org/drawingml/2006/picture">
-                <pic:pic xmlns:pic="http://schemas.openxmlformats.org/drawingml/2006/picture">
-                  <pic:nvPicPr>
-                    <pic:cNvPr id="0" name="Picture 3"/>
-                    <pic:cNvPicPr>
-                      <a:picLocks noChangeAspect="1" noChangeArrowheads="1"/>
-                    </pic:cNvPicPr>
-                  </pic:nvPicPr>
-                  <pic:blipFill>
-                    <a:blip r:embed="rId7">
-                      <a:duotone>
-                        <a:prstClr val="black"/>
-                        <a:schemeClr val="accent5">
-                          <a:tint val="45000"/>
-                          <a:satMod val="400000"/>
-                        </a:schemeClr>
-                      </a:duotone>
-                      <a:extLst>
-                        <a:ext uri="{28A0092B-C50C-407E-A947-70E740481C1C}">
-                          <a14:useLocalDpi xmlns:a14="http://schemas.microsoft.com/office/drawing/2010/main" val="0"/>
-                        </a:ext>
-                      </a:extLst>
-                    </a:blip>
-                    <a:srcRect/>
-                    <a:stretch>
-                      <a:fillRect/>
-                    </a:stretch>
-                  </pic:blipFill>
-                  <pic:spPr bwMode="auto">
-                    <a:xfrm>
-                      <a:off x="0" y="0"/>
-                      <a:ext cx="6321425" cy="4646930"/>
-                    </a:xfrm>
-                    <a:prstGeom prst="rect">
-                      <a:avLst/>
-                    </a:prstGeom>
-                    <a:noFill/>
-                  </pic:spPr>
-                </pic:pic>
-              </a:graphicData>
-            </a:graphic>
-            <wp14:sizeRelH relativeFrom="margin">
-              <wp14:pctWidth>0</wp14:pctWidth>
-            </wp14:sizeRelH>
-            <wp14:sizeRelV relativeFrom="margin">
-              <wp14:pctHeight>0</wp14:pctHeight>
-            </wp14:sizeRelV>
-          </wp:anchor>
-        </w:drawing>
-      </w:r>
-      <w:r>
-        <w:rPr>
-          <w:rFonts w:asciiTheme="minorHAnsi" w:hAnsiTheme="minorHAnsi" w:cstheme="minorHAnsi"/>
-        </w:rPr>
-        <w:tab/>
-      </w:r>
     </w:p>
     <w:tbl>
       <w:tblPr>
@@ -1189,6 +1117,15 @@
         </w:tc>
       </w:tr>
     </w:tbl>
+    <w:p>
+      <w:pPr>
+        <w:spacing w:before="0" w:after="400" w:line="240" w:lineRule="auto"/>
+        <w:rPr>
+          <w:sz w:val="2"/>
+          <w:szCs w:val="2"/>
+        </w:rPr>
+      </w:pPr>
+    </w:p>
     <w:p/>
     <w:tbl>
       <w:tblPr>
@@ -1379,8 +1316,10 @@
     </w:tbl>
     <w:p>
       <w:pPr>
+        <w:spacing w:before="0" w:after="360" w:line="240" w:lineRule="auto"/>
         <w:rPr>
-          <w:rFonts w:asciiTheme="minorHAnsi" w:hAnsiTheme="minorHAnsi" w:cstheme="minorHAnsi"/>
+          <w:sz w:val="2"/>
+          <w:szCs w:val="2"/>
         </w:rPr>
       </w:pPr>
     </w:p>
@@ -1437,6 +1376,15 @@
         </w:tc>
       </w:tr>
     </w:tbl>
+    <w:p>
+      <w:pPr>
+        <w:spacing w:before="0" w:after="400" w:line="240" w:lineRule="auto"/>
+        <w:rPr>
+          <w:sz w:val="2"/>
+          <w:szCs w:val="2"/>
+        </w:rPr>
+      </w:pPr>
+    </w:p>
     <w:p/>
     <w:tbl>
       <w:tblPr>
@@ -1624,6 +1572,15 @@
     </w:tbl>
     <w:p/>
     <w:p/>
+    <w:p>
+      <w:pPr>
+        <w:spacing w:before="0" w:after="360" w:line="240" w:lineRule="auto"/>
+        <w:rPr>
+          <w:sz w:val="2"/>
+          <w:szCs w:val="2"/>
+        </w:rPr>
+      </w:pPr>
+    </w:p>
     <w:tbl>
       <w:tblPr>
         <w:tblW w:w="9782" w:type="dxa"/>
@@ -1674,6 +1631,15 @@
         </w:tc>
       </w:tr>
     </w:tbl>
+    <w:p>
+      <w:pPr>
+        <w:spacing w:before="0" w:after="400" w:line="240" w:lineRule="auto"/>
+        <w:rPr>
+          <w:sz w:val="2"/>
+          <w:szCs w:val="2"/>
+        </w:rPr>
+      </w:pPr>
+    </w:p>
     <w:p/>
     <w:tbl>
       <w:tblPr>
@@ -1857,6 +1823,15 @@
       </w:tr>
     </w:tbl>
     <w:p/>
+    <w:p>
+      <w:pPr>
+        <w:spacing w:before="0" w:after="360" w:line="240" w:lineRule="auto"/>
+        <w:rPr>
+          <w:sz w:val="2"/>
+          <w:szCs w:val="2"/>
+        </w:rPr>
+      </w:pPr>
+    </w:p>
     <w:tbl>
       <w:tblPr>
         <w:tblW w:w="9782" w:type="dxa"/>
@@ -1907,6 +1882,15 @@
         </w:tc>
       </w:tr>
     </w:tbl>
+    <w:p>
+      <w:pPr>
+        <w:spacing w:before="0" w:after="400" w:line="240" w:lineRule="auto"/>
+        <w:rPr>
+          <w:sz w:val="2"/>
+          <w:szCs w:val="2"/>
+        </w:rPr>
+      </w:pPr>
+    </w:p>
     <w:p/>
     <w:tbl>
       <w:tblPr>
@@ -2097,6 +2081,15 @@
         <w:t xml:space="preserve">{#has_projects}</w:t>
       </w:r>
     </w:p>
+    <w:p>
+      <w:pPr>
+        <w:spacing w:before="0" w:after="360" w:line="240" w:lineRule="auto"/>
+        <w:rPr>
+          <w:sz w:val="2"/>
+          <w:szCs w:val="2"/>
+        </w:rPr>
+      </w:pPr>
+    </w:p>
     <w:tbl>
       <w:tblPr>
         <w:tblW w:w="9782" w:type="dxa"/>
@@ -2147,6 +2140,15 @@
         </w:tc>
       </w:tr>
     </w:tbl>
+    <w:p>
+      <w:pPr>
+        <w:spacing w:before="0" w:after="400" w:line="240" w:lineRule="auto"/>
+        <w:rPr>
+          <w:sz w:val="2"/>
+          <w:szCs w:val="2"/>
+        </w:rPr>
+      </w:pPr>
+    </w:p>
     <w:tbl>
       <w:tblPr>
         <w:tblW w:w="9782" w:type="dxa"/>
@@ -2293,6 +2295,15 @@
         <w:t xml:space="preserve">{#has_achievements}</w:t>
       </w:r>
     </w:p>
+    <w:p>
+      <w:pPr>
+        <w:spacing w:before="0" w:after="360" w:line="240" w:lineRule="auto"/>
+        <w:rPr>
+          <w:sz w:val="2"/>
+          <w:szCs w:val="2"/>
+        </w:rPr>
+      </w:pPr>
+    </w:p>
     <w:tbl>
       <w:tblPr>
         <w:tblW w:w="9782" w:type="dxa"/>
@@ -2343,6 +2354,15 @@
         </w:tc>
       </w:tr>
     </w:tbl>
+    <w:p>
+      <w:pPr>
+        <w:spacing w:before="0" w:after="400" w:line="240" w:lineRule="auto"/>
+        <w:rPr>
+          <w:sz w:val="2"/>
+          <w:szCs w:val="2"/>
+        </w:rPr>
+      </w:pPr>
+    </w:p>
     <w:p/>
     <w:tbl>
       <w:tblPr>
@@ -2404,6 +2424,15 @@
       </w:r>
     </w:p>
     <w:p/>
+    <w:p>
+      <w:pPr>
+        <w:spacing w:before="0" w:after="360" w:line="240" w:lineRule="auto"/>
+        <w:rPr>
+          <w:sz w:val="2"/>
+          <w:szCs w:val="2"/>
+        </w:rPr>
+      </w:pPr>
+    </w:p>
     <w:tbl>
       <w:tblPr>
         <w:tblW w:w="9782" w:type="dxa"/>
@@ -2454,6 +2483,15 @@
         </w:tc>
       </w:tr>
     </w:tbl>
+    <w:p>
+      <w:pPr>
+        <w:spacing w:before="0" w:after="400" w:line="240" w:lineRule="auto"/>
+        <w:rPr>
+          <w:sz w:val="2"/>
+          <w:szCs w:val="2"/>
+        </w:rPr>
+      </w:pPr>
+    </w:p>
     <w:p/>
     <w:p>
       <w:r>
@@ -2535,6 +2573,7 @@
             <w:r>
               <w:rPr>
                 <w:rFonts w:ascii="Century Gothic" w:hAnsi="Century Gothic" w:cs="Century Gothic"/>
+                <w:b/>
                 <w:sz w:val="18"/>
                 <w:szCs w:val="18"/>
               </w:rPr>
@@ -2603,6 +2642,7 @@
             <w:r>
               <w:rPr>
                 <w:rFonts w:ascii="Century Gothic" w:hAnsi="Century Gothic" w:cs="Century Gothic"/>
+                <w:b/>
                 <w:sz w:val="18"/>
                 <w:szCs w:val="18"/>
               </w:rPr>
@@ -2671,6 +2711,7 @@
             <w:r>
               <w:rPr>
                 <w:rFonts w:ascii="Century Gothic" w:hAnsi="Century Gothic" w:cs="Century Gothic"/>
+                <w:b/>
                 <w:sz w:val="18"/>
                 <w:szCs w:val="18"/>
               </w:rPr>
@@ -2739,6 +2780,7 @@
             <w:r>
               <w:rPr>
                 <w:rFonts w:ascii="Century Gothic" w:hAnsi="Century Gothic" w:cs="Century Gothic"/>
+                <w:b/>
                 <w:sz w:val="18"/>
                 <w:szCs w:val="18"/>
               </w:rPr>
@@ -2748,9 +2790,7 @@
         </w:tc>
       </w:tr>
       <w:tr>
-        <w:trPr>
-          <w:trHeight w:val="1562"/>
-        </w:trPr>
+        <w:trPr/>
         <w:tc>
           <w:tcPr>
             <w:tcW w:w="9782" w:type="dxa"/>
@@ -2867,6 +2907,15 @@
         </w:tc>
       </w:tr>
     </w:tbl>
+    <w:p>
+      <w:pPr>
+        <w:spacing w:before="0" w:after="440" w:line="240" w:lineRule="auto"/>
+        <w:rPr>
+          <w:sz w:val="2"/>
+          <w:szCs w:val="2"/>
+        </w:rPr>
+      </w:pPr>
+    </w:p>
     <w:p>
       <w:r>
         <w:t xml:space="preserve">{/employment}</w:t>

</xml_diff>